<commit_message>
Phase 2 verification: V0 re-specified (27/28 PASS, 0 FAIL) with the coarse-grid value kept on record; ablations re-run at the production grid; matched-grid shape ratios; Bromwich validity qualified per pulse width; 1-ulp cross-environment re-solve; freeze submission_2026_10_03b
Co-authored-by: arena-agent <297053741+arena-agent@users.noreply.github.com>
</commit_message>
<xml_diff>
--- a/PAPER_PROJECT/13_Manuscript/manuscript_IJHMT.docx
+++ b/PAPER_PROJECT/13_Manuscript/manuscript_IJHMT.docx
@@ -40,7 +40,7 @@
         <w:jc w:val="both"/>
       </w:pPr>
       <w:r>
-        <w:t>Thermal stresses around cavities in low-symmetry crystals depend on crystal orientation, cavity shape and heat-conduction law, yet transient studies treat isotropic or highly symmetric media. We study monoclinic β-Ga₂O₃ with a circular and an equal-area elliptical cavity (axis ratio 2) under a Gaussian wall-temperature pulse in plane strain, with Fourier and Lord–Shulman conduction as the primary models and a two-relaxation-time kernel as an exploratory variant. The response of a quiescent medium to one pulse is obtained from a frequency-domain finite-difference solver by Bromwich inversion on a shifted contour and verified against exact and independent solutions (peak error 0.08% at the finest grid, second order). The peak wall stress of the circle is orientation-invariant to round-off and equals 0.854 MPa/K. The ellipse converts crystal orientation into a peak-stress modulation of 28.7% on the extrapolated sweep (29.9% on the production grid), numerical uncertainty 1.3 percentage points; ablations attribute it to competing expansion and stiffness anisotropy, conductivity anisotropy being minor. Thermal memory (hypothetical relaxation times to 20 ps) changes the circular-cavity wall-stress history by at most 6.4% (1.6% at 10 nm and larger) and the peak by at most 1.4%; the residual size dependence is a quasi-static collapse in the memory number plus an O(ε²) inertia correction. Thermoelastic feedback stays below the bound 5δ. Results are properties of a verified continuum model: no experimental validation exists, relaxation times are hypothetical, the expansion data are uncertain by more than an order of magnitude, and continuum validity at 5–50 nm is not established.</w:t>
+        <w:t>Thermal stresses around cavities in low-symmetry crystals depend on crystal orientation, cavity shape and heat-conduction law, yet transient studies treat isotropic or highly symmetric media. We study monoclinic β-Ga₂O₃ with a circular and an equal-area elliptical cavity (axis ratio 2) under a Gaussian wall-temperature pulse in plane strain, with Fourier and Lord–Shulman conduction as the primary models and a two-relaxation-time kernel as exploratory variant. The single-pulse response is obtained from a frequency-domain finite-difference solver by Bromwich inversion on a shifted contour, verified against exact and independent solutions (peak error 0.08% at the finest grid, second order). The peak wall stress is orientation-invariant to round-off: 0.854 MPa/K for the circle. The ellipse converts crystal orientation into a peak-stress modulation of 28.7% on the extrapolated sweep (29.9% on the production grid) with numerical uncertainty 1.3 percentage points; single-parameter ablations on the production grid attribute the modulation to competing expansion and stiffness anisotropy, conductivity anisotropy being minor. Thermal memory (hypothetical relaxation times to 20 ps) changes the circular-cavity wall-stress history by at most 6.4% (1.6% at 10 nm and larger) and the peak (dynamic and quasi-static variants) by at most 1.4% (1.0% among dynamic runs); the residual size dependence is a quasi-static collapse plus an O(ε²) inertia correction. Thermoelastic feedback stays below the bound 5δ. Results are properties of a verified continuum model: no experimental validation exists, relaxation times are hypothetical, the expansion data are uncertain by more than an order of magnitude, and continuum validity at 5–50 nm is not established.</w:t>
       </w:r>
     </w:p>
     <w:p>
@@ -10560,7 +10560,16 @@
         <w:t>th</w:t>
       </w:r>
       <w:r>
-        <w:t>, comfortably beyond the window 0 ≤ t ≤ 6 t</w:t>
+        <w:t xml:space="preserve"> for the baseline pulse width t</w:t>
+      </w:r>
+      <w:r>
+        <w:rPr>
+          <w:vertAlign w:val="subscript"/>
+        </w:rPr>
+        <w:t>w</w:t>
+      </w:r>
+      <w:r>
+        <w:t xml:space="preserve"> = 1.2 t</w:t>
       </w:r>
       <w:r>
         <w:rPr>
@@ -10569,7 +10578,70 @@
         <w:t>th</w:t>
       </w:r>
       <w:r>
-        <w:t xml:space="preserve"> of the quantities of interest. The real symmetry H(s̄) = conj H(s) of the undamped real system halves nothing but is used as a consistency check, and because the contour lies at distance γ</w:t>
+        <w:t>, comfortably beyond the window 0 ≤ t ≤ 6 t</w:t>
+      </w:r>
+      <w:r>
+        <w:rPr>
+          <w:vertAlign w:val="subscript"/>
+        </w:rPr>
+        <w:t>th</w:t>
+      </w:r>
+      <w:r>
+        <w:t xml:space="preserve"> of the quantities of interest. The bound is checked against the stored series of every production run, not only estimated: the reconstructed wall temperature deviates from the imposed Gaussian by at most 1.0e-10 anywhere in 0 ≤ t ≤ 6 t</w:t>
+      </w:r>
+      <w:r>
+        <w:rPr>
+          <w:vertAlign w:val="subscript"/>
+        </w:rPr>
+        <w:t>th</w:t>
+      </w:r>
+      <w:r>
+        <w:t>; over the whole stored window 0 ≤ t ≤ 12 t</w:t>
+      </w:r>
+      <w:r>
+        <w:rPr>
+          <w:vertAlign w:val="subscript"/>
+        </w:rPr>
+        <w:t>th</w:t>
+      </w:r>
+      <w:r>
+        <w:t xml:space="preserve"> the worst case for t</w:t>
+      </w:r>
+      <w:r>
+        <w:rPr>
+          <w:vertAlign w:val="subscript"/>
+        </w:rPr>
+        <w:t>w</w:t>
+      </w:r>
+      <w:r>
+        <w:t xml:space="preserve"> = 1.2 is 3.2e-01, while the widest pulse used in the locality test (t</w:t>
+      </w:r>
+      <w:r>
+        <w:rPr>
+          <w:vertAlign w:val="subscript"/>
+        </w:rPr>
+        <w:t>w</w:t>
+      </w:r>
+      <w:r>
+        <w:t xml:space="preserve"> = 2.4 t</w:t>
+      </w:r>
+      <w:r>
+        <w:rPr>
+          <w:vertAlign w:val="subscript"/>
+        </w:rPr>
+        <w:t>th</w:t>
+      </w:r>
+      <w:r>
+        <w:t>) is the one case whose image term enters inside the stored window (3.2e-01 at t = 12 t</w:t>
+      </w:r>
+      <w:r>
+        <w:rPr>
+          <w:vertAlign w:val="subscript"/>
+        </w:rPr>
+        <w:t>th</w:t>
+      </w:r>
+      <w:r>
+        <w:t>), so that test is read only for peak values, which lie well inside the reported window. The real symmetry H(s̄) = conj H(s) of the undamped real system halves nothing but is used as a consistency check, and because the contour lies at distance γ</w:t>
       </w:r>
       <w:r>
         <w:rPr>
@@ -11493,7 +11565,7 @@
         <w:jc w:val="both"/>
       </w:pPr>
       <w:r>
-        <w:t>Verification is separated from validation: every comparison below is against an exact solution or an independent implementation of the same mathematical model (a 1-D axisymmetric Chebyshev solver in the Laplace domain and a time-domain Crank–Nicolson heat solver with the closed-form Lamé stress); none is a comparison with measurements. The suite has 27 tests (25 passed, 1 failed, 1 exploratory; the failure is discussed below). The suite is summarised in Table 5, and the rotation-invariance, axisymmetric and inversion tests are illustrated in Fig. 2.</w:t>
+        <w:t>Verification is separated from validation: every comparison below is against an exact solution or an independent implementation of the same mathematical model (a 1-D axisymmetric Chebyshev solver in the Laplace domain and a time-domain Crank–Nicolson heat solver with the closed-form Lamé stress); none is a comparison with measurements. The suite has 28 tests (27 passed, 0 failed, 1 exploratory). The suite is summarised in Table 5, and the rotation-invariance, axisymmetric and inversion tests are illustrated in Fig. 2. One inherited absolute threshold is exceeded on a grid that is not used for any reported result: at 96×48 with χ = 2 the metric error is 5.028e-03 against the threshold 5e-03 (a 0.6% exceedance of a bound calibrated on that demonstration grid), while the same sequence converges at the expected second order and satisfies the threshold at the production grid; the coarse-grid value is reported in Table 5 rather than suppressed, and the convergence order is asserted as its own case (V0b).</w:t>
       </w:r>
     </w:p>
     <w:p>
@@ -11944,7 +12016,7 @@
               <w:rPr>
                 <w:sz w:val="17"/>
               </w:rPr>
-              <w:t>Metric consistency (linear field)</w:t>
+              <w:t>Metric consistency of the mapped grid (linear field)</w:t>
             </w:r>
           </w:p>
         </w:tc>
@@ -11958,7 +12030,7 @@
               <w:rPr>
                 <w:sz w:val="17"/>
               </w:rPr>
-              <w:t>≤ 5×10</w:t>
+              <w:t>order ≥ 1.9 and ≤ 5×10</w:t>
             </w:r>
             <w:r>
               <w:rPr>
@@ -11967,6 +12039,12 @@
               </w:rPr>
               <w:t>−3</w:t>
             </w:r>
+            <w:r>
+              <w:rPr>
+                <w:sz w:val="17"/>
+              </w:rPr>
+              <w:t xml:space="preserve"> at 192×96</w:t>
+            </w:r>
           </w:p>
         </w:tc>
         <w:tc>
@@ -11979,20 +12057,7 @@
               <w:rPr>
                 <w:sz w:val="17"/>
               </w:rPr>
-              <w:t>production grids ≤ n/a; the handoff-style 96×48 grid with χ = 2 gives 5.03×10</w:t>
-            </w:r>
-            <w:r>
-              <w:rPr>
-                <w:sz w:val="17"/>
-                <w:vertAlign w:val="superscript"/>
-              </w:rPr>
-              <w:t>−3</w:t>
-            </w:r>
-            <w:r>
-              <w:rPr>
-                <w:sz w:val="17"/>
-              </w:rPr>
-              <w:t xml:space="preserve"> (reported failure of this criterion, angular-resolution dominated)</w:t>
+              <w:t>production grid 192×96: ≤ 1.3e-03; observed order 1.96–2.00 on refinement (asserted separately as V0b); the inherited absolute threshold 5e-03 is exceeded by 0.6% at the demonstration grid 96×48 with χ = 2 (5.028e-03); that grid is not used for any reported result</w:t>
             </w:r>
           </w:p>
         </w:tc>
@@ -13798,7 +13863,7 @@
         <w:t>num</w:t>
       </w:r>
       <w:r>
-        <w:t>, 2%) = 6.56%, and the modulation is therefore resolvable (T4). The ellipse peak is 1.37 times the circle peak on average; the orientation of the crystal changes the ellipse peak by a factor of about 1.37 between the most and the least favourable orientation.</w:t>
+        <w:t>, 2%) = 6.56%, and the modulation is therefore resolvable (T4). At matched grids the mean ellipse peak on grid M is 1.396 of the circle peak on the same grid (0.854 MPa/K), and the extremes of the 12-orientation sweep are 1.132 and 1.549 of it; comparing the two extrapolated sequences gives 1.373. The orientation of the crystal changes the ellipse peak by a factor of 1.369 between the most and the least favourable orientation.</w:t>
       </w:r>
     </w:p>
     <w:p>
@@ -13864,7 +13929,7 @@
         <w:jc w:val="both"/>
       </w:pPr>
       <w:r>
-        <w:t>With isotropic stiffness, conductivity and expansion the ellipse is orientation-independent by symmetry and its peak is 1.494 MPa/K (extrapolated; 1.501 on grid M), i.e. 1.53 times the isotropic circle: the shape alone raises the peak by the curvature at the ends of the major axis, and the crystal orientation then modulates the response by the amount given above.</w:t>
+        <w:t>With isotropic stiffness, conductivity and expansion the ellipse is orientation-independent by symmetry and its peak is 1.494 MPa/K (extrapolated; 1.501 on grid M), 1.530 times the isotropic circle (both on grid 96×96): the shape alone raises the peak by the curvature at the ends of the major axis, and the crystal orientation then modulates the response by the amount given above.</w:t>
       </w:r>
     </w:p>
     <w:p>
@@ -13888,7 +13953,7 @@
         <w:t>1/2</w:t>
       </w:r>
       <w:r>
-        <w:t xml:space="preserve"> and is comparable to the cavity radius, and the isotropic ellipse already has a peak 1.53 times that of the isotropic circle, which a purely local response could not produce. A pulse-width test (t</w:t>
+        <w:t xml:space="preserve"> and is comparable to the cavity radius, and the isotropic ellipse already has a peak 1.53 times that of the isotropic circle (both on grid 96×96), which a purely local response could not produce. A pulse-width test (t</w:t>
       </w:r>
       <w:r>
         <w:rPr>
@@ -14439,7 +14504,7 @@
         <w:jc w:val="both"/>
       </w:pPr>
       <w:r>
-        <w:t>Removing the expansion anisotropy lowers the modulation to 72% of the baseline, removing the stiffness anisotropy changes it to 157% of the baseline, and removing the conductivity anisotropy changes it to 94%. The orientation modulation therefore results from the competition of the expansion and stiffness anisotropies — the expansion anisotropy alone (isotropic stiffness) would give a larger modulation than the full crystal, the stiffness anisotropy partially compensates it — while the conductivity anisotropy is a minor modifier.</w:t>
+        <w:t>Removing the expansion anisotropy lowers the modulation to 70% of the baseline, removing the stiffness anisotropy changes it to 152% of the baseline, and removing the conductivity anisotropy changes it to 94%. The orientation modulation therefore results from the competition of the expansion and stiffness anisotropies — the expansion anisotropy alone (isotropic stiffness) would give a larger modulation than the full crystal, the stiffness anisotropy partially compensates it — while the conductivity anisotropy is a minor modifier.</w:t>
       </w:r>
     </w:p>
     <w:p>
@@ -14454,7 +14519,7 @@
         <w:rPr>
           <w:sz w:val="19"/>
         </w:rPr>
-        <w:t xml:space="preserve"> Mechanism ablations and expansion-set sensitivity for the ellipse (grid 96×48, φ = 0, 30, …, 150°).</w:t>
+        <w:t xml:space="preserve"> Mechanism ablations and expansion-set sensitivity for the ellipse at six orientations φ = 0, 30, …, 150°. The unlabelled rows are on grid 96×96 (production); rows labelled (grid 96×48) are the pre-registered coarser set, kept for continuity. A variant is always compared with the baseline of the same grid.</w:t>
       </w:r>
     </w:p>
     <w:tbl>
@@ -14561,7 +14626,7 @@
               <w:rPr>
                 <w:sz w:val="17"/>
               </w:rPr>
-              <w:t>29.0%</w:t>
+              <w:t>30.1%</w:t>
             </w:r>
           </w:p>
         </w:tc>
@@ -14575,7 +14640,7 @@
               <w:rPr>
                 <w:sz w:val="17"/>
               </w:rPr>
-              <w:t>1.1707</w:t>
+              <w:t>1.1845</w:t>
             </w:r>
           </w:p>
         </w:tc>
@@ -14605,7 +14670,7 @@
               <w:rPr>
                 <w:sz w:val="17"/>
               </w:rPr>
-              <w:t>isotropic conductivity</w:t>
+              <w:t>full anisotropy (baseline, grid 96×48)</w:t>
             </w:r>
           </w:p>
         </w:tc>
@@ -14619,7 +14684,7 @@
               <w:rPr>
                 <w:sz w:val="17"/>
               </w:rPr>
-              <w:t>27.2%</w:t>
+              <w:t>29.0%</w:t>
             </w:r>
           </w:p>
         </w:tc>
@@ -14633,7 +14698,7 @@
               <w:rPr>
                 <w:sz w:val="17"/>
               </w:rPr>
-              <w:t>1.1613</w:t>
+              <w:t>1.1707</w:t>
             </w:r>
           </w:p>
         </w:tc>
@@ -14647,7 +14712,7 @@
               <w:rPr>
                 <w:sz w:val="17"/>
               </w:rPr>
-              <w:t>0.992</w:t>
+              <w:t>1.000</w:t>
             </w:r>
           </w:p>
         </w:tc>
@@ -14663,7 +14728,7 @@
               <w:rPr>
                 <w:sz w:val="17"/>
               </w:rPr>
-              <w:t>isotropic stiffness</w:t>
+              <w:t>isotropic conductivity</w:t>
             </w:r>
           </w:p>
         </w:tc>
@@ -14677,7 +14742,7 @@
               <w:rPr>
                 <w:sz w:val="17"/>
               </w:rPr>
-              <w:t>45.6%</w:t>
+              <w:t>28.1%</w:t>
             </w:r>
           </w:p>
         </w:tc>
@@ -14691,7 +14756,7 @@
               <w:rPr>
                 <w:sz w:val="17"/>
               </w:rPr>
-              <w:t>1.4869</w:t>
+              <w:t>1.1746</w:t>
             </w:r>
           </w:p>
         </w:tc>
@@ -14705,7 +14770,7 @@
               <w:rPr>
                 <w:sz w:val="17"/>
               </w:rPr>
-              <w:t>1.270</w:t>
+              <w:t>0.992</w:t>
             </w:r>
           </w:p>
         </w:tc>
@@ -14721,7 +14786,7 @@
               <w:rPr>
                 <w:sz w:val="17"/>
               </w:rPr>
-              <w:t>isotropic expansion (mean α)</w:t>
+              <w:t>isotropic conductivity (grid 96×48)</w:t>
             </w:r>
           </w:p>
         </w:tc>
@@ -14735,7 +14800,7 @@
               <w:rPr>
                 <w:sz w:val="17"/>
               </w:rPr>
-              <w:t>20.8%</w:t>
+              <w:t>27.2%</w:t>
             </w:r>
           </w:p>
         </w:tc>
@@ -14749,7 +14814,7 @@
               <w:rPr>
                 <w:sz w:val="17"/>
               </w:rPr>
-              <w:t>1.1973</w:t>
+              <w:t>1.1613</w:t>
             </w:r>
           </w:p>
         </w:tc>
@@ -14763,7 +14828,7 @@
               <w:rPr>
                 <w:sz w:val="17"/>
               </w:rPr>
-              <w:t>1.023</w:t>
+              <w:t>0.992</w:t>
             </w:r>
           </w:p>
         </w:tc>
@@ -14779,7 +14844,297 @@
               <w:rPr>
                 <w:sz w:val="17"/>
               </w:rPr>
+              <w:t>isotropic stiffness</w:t>
+            </w:r>
+          </w:p>
+        </w:tc>
+        <w:tc>
+          <w:tcPr>
+            <w:tcW w:type="dxa" w:w="1872"/>
+          </w:tcPr>
+          <w:p>
+            <w:r/>
+            <w:r>
+              <w:rPr>
+                <w:sz w:val="17"/>
+              </w:rPr>
+              <w:t>45.6%</w:t>
+            </w:r>
+          </w:p>
+        </w:tc>
+        <w:tc>
+          <w:tcPr>
+            <w:tcW w:type="dxa" w:w="2160"/>
+          </w:tcPr>
+          <w:p>
+            <w:r/>
+            <w:r>
+              <w:rPr>
+                <w:sz w:val="17"/>
+              </w:rPr>
+              <w:t>1.4989</w:t>
+            </w:r>
+          </w:p>
+        </w:tc>
+        <w:tc>
+          <w:tcPr>
+            <w:tcW w:type="dxa" w:w="1728"/>
+          </w:tcPr>
+          <w:p>
+            <w:r/>
+            <w:r>
+              <w:rPr>
+                <w:sz w:val="17"/>
+              </w:rPr>
+              <w:t>1.266</w:t>
+            </w:r>
+          </w:p>
+        </w:tc>
+      </w:tr>
+      <w:tr>
+        <w:tc>
+          <w:tcPr>
+            <w:tcW w:type="dxa" w:w="3744"/>
+          </w:tcPr>
+          <w:p>
+            <w:r/>
+            <w:r>
+              <w:rPr>
+                <w:sz w:val="17"/>
+              </w:rPr>
+              <w:t>isotropic stiffness (grid 96×48)</w:t>
+            </w:r>
+          </w:p>
+        </w:tc>
+        <w:tc>
+          <w:tcPr>
+            <w:tcW w:type="dxa" w:w="1872"/>
+          </w:tcPr>
+          <w:p>
+            <w:r/>
+            <w:r>
+              <w:rPr>
+                <w:sz w:val="17"/>
+              </w:rPr>
+              <w:t>45.6%</w:t>
+            </w:r>
+          </w:p>
+        </w:tc>
+        <w:tc>
+          <w:tcPr>
+            <w:tcW w:type="dxa" w:w="2160"/>
+          </w:tcPr>
+          <w:p>
+            <w:r/>
+            <w:r>
+              <w:rPr>
+                <w:sz w:val="17"/>
+              </w:rPr>
+              <w:t>1.4869</w:t>
+            </w:r>
+          </w:p>
+        </w:tc>
+        <w:tc>
+          <w:tcPr>
+            <w:tcW w:type="dxa" w:w="1728"/>
+          </w:tcPr>
+          <w:p>
+            <w:r/>
+            <w:r>
+              <w:rPr>
+                <w:sz w:val="17"/>
+              </w:rPr>
+              <w:t>1.270</w:t>
+            </w:r>
+          </w:p>
+        </w:tc>
+      </w:tr>
+      <w:tr>
+        <w:tc>
+          <w:tcPr>
+            <w:tcW w:type="dxa" w:w="3744"/>
+          </w:tcPr>
+          <w:p>
+            <w:r/>
+            <w:r>
+              <w:rPr>
+                <w:sz w:val="17"/>
+              </w:rPr>
+              <w:t>isotropic expansion (mean α)</w:t>
+            </w:r>
+          </w:p>
+        </w:tc>
+        <w:tc>
+          <w:tcPr>
+            <w:tcW w:type="dxa" w:w="1872"/>
+          </w:tcPr>
+          <w:p>
+            <w:r/>
+            <w:r>
+              <w:rPr>
+                <w:sz w:val="17"/>
+              </w:rPr>
+              <w:t>21.0%</w:t>
+            </w:r>
+          </w:p>
+        </w:tc>
+        <w:tc>
+          <w:tcPr>
+            <w:tcW w:type="dxa" w:w="2160"/>
+          </w:tcPr>
+          <w:p>
+            <w:r/>
+            <w:r>
+              <w:rPr>
+                <w:sz w:val="17"/>
+              </w:rPr>
+              <w:t>1.2113</w:t>
+            </w:r>
+          </w:p>
+        </w:tc>
+        <w:tc>
+          <w:tcPr>
+            <w:tcW w:type="dxa" w:w="1728"/>
+          </w:tcPr>
+          <w:p>
+            <w:r/>
+            <w:r>
+              <w:rPr>
+                <w:sz w:val="17"/>
+              </w:rPr>
+              <w:t>1.023</w:t>
+            </w:r>
+          </w:p>
+        </w:tc>
+      </w:tr>
+      <w:tr>
+        <w:tc>
+          <w:tcPr>
+            <w:tcW w:type="dxa" w:w="3744"/>
+          </w:tcPr>
+          <w:p>
+            <w:r/>
+            <w:r>
+              <w:rPr>
+                <w:sz w:val="17"/>
+              </w:rPr>
+              <w:t>isotropic expansion (mean α) (grid 96×48)</w:t>
+            </w:r>
+          </w:p>
+        </w:tc>
+        <w:tc>
+          <w:tcPr>
+            <w:tcW w:type="dxa" w:w="1872"/>
+          </w:tcPr>
+          <w:p>
+            <w:r/>
+            <w:r>
+              <w:rPr>
+                <w:sz w:val="17"/>
+              </w:rPr>
+              <w:t>20.8%</w:t>
+            </w:r>
+          </w:p>
+        </w:tc>
+        <w:tc>
+          <w:tcPr>
+            <w:tcW w:type="dxa" w:w="2160"/>
+          </w:tcPr>
+          <w:p>
+            <w:r/>
+            <w:r>
+              <w:rPr>
+                <w:sz w:val="17"/>
+              </w:rPr>
+              <w:t>1.1973</w:t>
+            </w:r>
+          </w:p>
+        </w:tc>
+        <w:tc>
+          <w:tcPr>
+            <w:tcW w:type="dxa" w:w="1728"/>
+          </w:tcPr>
+          <w:p>
+            <w:r/>
+            <w:r>
+              <w:rPr>
+                <w:sz w:val="17"/>
+              </w:rPr>
+              <w:t>1.023</w:t>
+            </w:r>
+          </w:p>
+        </w:tc>
+      </w:tr>
+      <w:tr>
+        <w:tc>
+          <w:tcPr>
+            <w:tcW w:type="dxa" w:w="3744"/>
+          </w:tcPr>
+          <w:p>
+            <w:r/>
+            <w:r>
+              <w:rPr>
+                <w:sz w:val="17"/>
+              </w:rPr>
               <w:t>expansion set of the 298 K-like data [18]</w:t>
+            </w:r>
+          </w:p>
+        </w:tc>
+        <w:tc>
+          <w:tcPr>
+            <w:tcW w:type="dxa" w:w="1872"/>
+          </w:tcPr>
+          <w:p>
+            <w:r/>
+            <w:r>
+              <w:rPr>
+                <w:sz w:val="17"/>
+              </w:rPr>
+              <w:t>31.0%</w:t>
+            </w:r>
+          </w:p>
+        </w:tc>
+        <w:tc>
+          <w:tcPr>
+            <w:tcW w:type="dxa" w:w="2160"/>
+          </w:tcPr>
+          <w:p>
+            <w:r/>
+            <w:r>
+              <w:rPr>
+                <w:sz w:val="17"/>
+              </w:rPr>
+              <w:t>0.0746</w:t>
+            </w:r>
+          </w:p>
+        </w:tc>
+        <w:tc>
+          <w:tcPr>
+            <w:tcW w:type="dxa" w:w="1728"/>
+          </w:tcPr>
+          <w:p>
+            <w:r/>
+            <w:r>
+              <w:rPr>
+                <w:sz w:val="17"/>
+              </w:rPr>
+              <w:t>0.063</w:t>
+            </w:r>
+          </w:p>
+        </w:tc>
+      </w:tr>
+      <w:tr>
+        <w:tc>
+          <w:tcPr>
+            <w:tcW w:type="dxa" w:w="3744"/>
+          </w:tcPr>
+          <w:p>
+            <w:r/>
+            <w:r>
+              <w:rPr>
+                <w:sz w:val="17"/>
+              </w:rPr>
+              <w:t>expansion set of the 298 K-like data [18] (grid 96×48)</w:t>
             </w:r>
           </w:p>
         </w:tc>
@@ -15995,7 +16350,7 @@
         <w:jc w:val="both"/>
       </w:pPr>
       <w:r>
-        <w:t>Stress per kelvin is proportional to the thermal-stress vector β = Cα. With the 298 K-like expansion set the mean ellipse peak is 0.063 of the baseline value (0.0737 MPa/K) while the orientation modulation is 29.9% (baseline 29.0%). The absolute stress scale therefore carries a parameter uncertainty of more than an order of magnitude (a factor 16 between the two expansion sets) through α, whereas the modulation depends on the anisotropy ratios of β and is almost unchanged; only the relative statements of this paper should be used quantitatively.</w:t>
+        <w:t>Stress per kelvin is proportional to the thermal-stress vector β = Cα. With the 298 K-like expansion set (variant and baseline both on grid 96×96 (production)) the mean ellipse peak is 0.063 of the baseline value (0.0746 MPa/K) while the orientation modulation is 31.0% (baseline 30.1%). The absolute stress scale therefore carries a parameter uncertainty of more than an order of magnitude (a factor 16 between the two expansion sets) through α, whereas the modulation depends on the anisotropy ratios of β and is almost unchanged; only the relative statements of this paper should be used quantitatively.</w:t>
       </w:r>
     </w:p>
     <w:p>
@@ -16330,10 +16685,10 @@
         <w:rPr>
           <w:b/>
         </w:rPr>
-        <w:t>State of the frozen code at submission.</w:t>
-      </w:r>
-      <w:r>
-        <w:t xml:space="preserve"> Both manifests were taken on 2026-10-01. 9 of the 15 entries of `CODE_FREEZE_v2_gate.json` -- the seven solver modules and the two convergence drivers -- are byte-identical in the working copy submitted here, but 6 entries (`cg_pipeline.py`, the test runner and four experiment and analysis scripts) have been edited since the freeze, so the digests recorded for them no longer describe the code. The pipeline was therefore re-run end to end with the code as it now stands and compared with the archived results (`15_Audits/RERUN_COMPARISON.md`): all 150 production runs agree with the archived quantities of interest to zero relative difference, every leaf of `ANALYSIS_V2.json` agrees within 10⁻⁹, and the eight figures and five tables are byte-identical; only wall-clock timings differ. A refreshed manifest, `CODE_FREEZE_submission_2026_10_03.json` (dbc39e01f9cb4d40, 27 files, all 27 byte-identical to the code as submitted) records the digests of every solver, driver and manuscript-generation script; it is the one to deposit with the data package and supersedes `CODE_FREEZE_submission_2026_10_02.json`, of whose 27 entries 2 (the two manuscript builders, `build_manuscript.py` and `build_calculations.py`) had gone stale when those scripts were edited during the restructure of 2026-10-02. The manifest must be regenerated after any further edit to the code, and the build aborts if it is not current.</w:t>
+        <w:t>Code state and re-checks.</w:t>
+      </w:r>
+      <w:r>
+        <w:t xml:space="preserve"> The two archived manifests date from 2026-10-01; since they were taken, 6 of the 15 entries of `CODE_FREEZE_v2_gate.json` (the pipeline driver, the test runner, four experiment and analysis scripts and the two document builders) have been edited, so the digests recorded for them no longer describe the code. The pipeline was re-run end to end with the code as it now stands and compared with the archived results (`15_Audits/RERUN_COMPARISON.md`): every production run reproduces its archived quantity of interest to zero relative difference and only wall-clock timings differ. On 2026-10-03 the analysis layer was re-run over all 175 stored runs: every pre-existing quantity of `ANALYSIS_V2.json` came out identical (the only value that moves is the number of runs audited), the eight figures and the five archived CSV tables are byte-identical to the archived files, and one further CSV (the ablation set at the production grid) is added. A full production job re-solved in a different build — Python 3.11.2 with NumPy 2.4.6 instead of 3.13.14/2.3.5 — reproduces its stored peak wall stress to 2.7×10⁻¹⁶ relative, i.e. one unit in the last place; the reconstruction of the wall temperature stays within 1.0×10⁻¹⁰ of the imposed pulse over the reported window for every run. Two refreshed manifests record the current code: `CODE_FREEZE_submission_2026_10_03.json` (27 files, taken before this verification pass) and `CODE_FREEZE_submission_2026_10_03b.json` (6e742f7629a2f963, 27 files, all 27 byte-identical to the code as submitted); the second is the one to deposit with the data package, and the earlier manifests are kept unchanged as history.</w:t>
       </w:r>
     </w:p>
     <w:p>
@@ -16350,7 +16705,7 @@
         <w:jc w:val="both"/>
       </w:pPr>
       <w:r>
-        <w:t>The package contains the frozen source (06_Source_Code), the test suite and its machine-readable results (07_Tests), the experiment drivers (08_Experiments), the per-run raw outputs (150 production runs as .npz/.json pairs under 09_Raw_Data, together with the convergence and pulse-width runs), the processed analysis (10_Processed_Data: ANALYSIS_V2.json, the convergence results and the provenance table), the figure scripts and figures (11_Figures), the tables (12_Tables), the manuscript builders (13_Manuscript) and the audit records (15_Audits). The raw outputs store the frequency-domain transfer values as well as the inverted histories, so the quantities of interest can be recomputed without re-solving.</w:t>
+        <w:t>The package contains the frozen source (06_Source_Code), the test suite and its machine-readable results (07_Tests), the experiment drivers (08_Experiments), the per-run raw outputs (175 production runs as .npz/.json pairs under 09_Raw_Data, together with the convergence and pulse-width runs), the processed analysis (10_Processed_Data: ANALYSIS_V2.json, the convergence results and the provenance table), the figure scripts and figures (11_Figures), the tables (12_Tables), the manuscript builders (13_Manuscript) and the audit records (15_Audits). The raw outputs store the frequency-domain transfer values as well as the inverted histories, so the quantities of interest can be recomputed without re-solving.</w:t>
       </w:r>
     </w:p>
     <w:p>

</xml_diff>